<commit_message>
Added Docker deployment changes
</commit_message>
<xml_diff>
--- a/Report.docx
+++ b/Report.docx
@@ -58,7 +58,7 @@
     <w:p>
       <w:r>
         <w:pict w14:anchorId="1592DD30">
-          <v:rect id="_x0000_i1025" style="width:0;height:1.5pt" o:hralign="center" o:hrstd="t" o:hr="t"/>
+          <v:rect id="_x0000_i1026" style="width:0;height:1.5pt" o:hralign="center" o:hrstd="t" o:hr="t"/>
         </w:pict>
       </w:r>
     </w:p>
@@ -147,7 +147,7 @@
     <w:p>
       <w:r>
         <w:pict w14:anchorId="3E3C306C">
-          <v:rect id="_x0000_i1026" style="width:0;height:1.5pt" o:hralign="center" o:hrstd="t" o:hr="t"/>
+          <v:rect id="_x0000_i1027" style="width:0;height:1.5pt" o:hralign="center" o:hrstd="t" o:hr="t"/>
         </w:pict>
       </w:r>
     </w:p>
@@ -167,15 +167,7 @@
         <w:pStyle w:val="FirstParagraph"/>
       </w:pPr>
       <w:r>
-        <w:t xml:space="preserve">Study Buddy addresses this problem using </w:t>
-      </w:r>
-      <w:proofErr w:type="gramStart"/>
-      <w:r>
-        <w:t>a Retrieval</w:t>
-      </w:r>
-      <w:proofErr w:type="gramEnd"/>
-      <w:r>
-        <w:t>-Augmented Generation (RAG) architecture.</w:t>
+        <w:t>Study Buddy addresses this problem using a Retrieval-Augmented Generation (RAG) architecture.</w:t>
       </w:r>
     </w:p>
     <w:p>
@@ -197,7 +189,7 @@
     <w:p>
       <w:r>
         <w:pict w14:anchorId="261A8759">
-          <v:rect id="_x0000_i1027" style="width:0;height:1.5pt" o:hralign="center" o:hrstd="t" o:hr="t"/>
+          <v:rect id="_x0000_i1028" style="width:0;height:1.5pt" o:hralign="center" o:hrstd="t" o:hr="t"/>
         </w:pict>
       </w:r>
     </w:p>
@@ -284,15 +276,7 @@
         <w:pStyle w:val="FirstParagraph"/>
       </w:pPr>
       <w:r>
-        <w:t xml:space="preserve">The </w:t>
-      </w:r>
-      <w:proofErr w:type="gramStart"/>
-      <w:r>
-        <w:t>frontend</w:t>
-      </w:r>
-      <w:proofErr w:type="gramEnd"/>
-      <w:r>
-        <w:t xml:space="preserve"> provides the user interface for document management and question answering, while the backend handles document processing, indexing, retrieval, and communication with language models.</w:t>
+        <w:t>The frontend provides the user interface for document management and question answering, while the backend handles document processing, indexing, retrieval, and communication with language models.</w:t>
       </w:r>
     </w:p>
     <w:p>
@@ -300,15 +284,7 @@
         <w:pStyle w:val="BodyText"/>
       </w:pPr>
       <w:r>
-        <w:t xml:space="preserve">The workflow begins when a user uploads a PDF or submits a question through the </w:t>
-      </w:r>
-      <w:proofErr w:type="gramStart"/>
-      <w:r>
-        <w:t>frontend</w:t>
-      </w:r>
-      <w:proofErr w:type="gramEnd"/>
-      <w:r>
-        <w:t>. Requests are sent to the backend through REST APIs. Uploaded documents are processed and indexed, while user queries trigger the retrieval pipeline. Relevant document content is retrieved, combined with conversational context, and passed to the language model for answer generation.</w:t>
+        <w:t>The workflow begins when a user uploads a PDF or submits a question through the frontend. Requests are sent to the backend through REST APIs. Uploaded documents are processed and indexed, while user queries trigger the retrieval pipeline. Relevant document content is retrieved, combined with conversational context, and passed to the language model for answer generation.</w:t>
       </w:r>
     </w:p>
     <w:p>
@@ -322,7 +298,7 @@
     <w:p>
       <w:r>
         <w:pict w14:anchorId="62C736E6">
-          <v:rect id="_x0000_i1028" style="width:0;height:1.5pt" o:hralign="center" o:hrstd="t" o:hr="t"/>
+          <v:rect id="_x0000_i1029" style="width:0;height:1.5pt" o:hralign="center" o:hrstd="t" o:hr="t"/>
         </w:pict>
       </w:r>
     </w:p>
@@ -395,14 +371,6 @@
     </w:p>
     <w:p>
       <w:pPr>
-        <w:pStyle w:val="BodyText"/>
-      </w:pPr>
-      <w:r>
-        <w:t>Axios was used for communication between the frontend and backend, handling document uploads, chat requests, document management operations, and status updates.</w:t>
-      </w:r>
-    </w:p>
-    <w:p>
-      <w:pPr>
         <w:pStyle w:val="Heading2"/>
       </w:pPr>
       <w:bookmarkStart w:id="8" w:name="backend"/>
@@ -428,7 +396,6 @@
       <w:r>
         <w:t xml:space="preserve"> and </w:t>
       </w:r>
-      <w:proofErr w:type="spellStart"/>
       <w:r>
         <w:rPr>
           <w:b/>
@@ -436,7 +403,6 @@
         </w:rPr>
         <w:t>FastAPI</w:t>
       </w:r>
-      <w:proofErr w:type="spellEnd"/>
       <w:r>
         <w:t>.</w:t>
       </w:r>
@@ -453,21 +419,8 @@
       <w:pPr>
         <w:pStyle w:val="BodyText"/>
       </w:pPr>
-      <w:proofErr w:type="spellStart"/>
-      <w:r>
-        <w:t>FastAPI</w:t>
-      </w:r>
-      <w:proofErr w:type="spellEnd"/>
-      <w:r>
-        <w:t xml:space="preserve"> provides high performance, asynchronous request handling, automatic API documentation, and request validation through </w:t>
-      </w:r>
-      <w:proofErr w:type="spellStart"/>
-      <w:r>
-        <w:t>Pydantic</w:t>
-      </w:r>
-      <w:proofErr w:type="spellEnd"/>
-      <w:r>
-        <w:t xml:space="preserve"> models. The backend manages PDF processing, indexing, retrieval, session management, and interaction with Large Language Models.</w:t>
+      <w:r>
+        <w:t>FastAPI provides high performance, asynchronous request handling, automatic API documentation, and request validation through Pydantic models. The backend manages PDF processing, indexing, retrieval, session management, and interaction with Large Language Models.</w:t>
       </w:r>
     </w:p>
     <w:p>
@@ -499,7 +452,6 @@
       <w:pPr>
         <w:pStyle w:val="BodyText"/>
       </w:pPr>
-      <w:proofErr w:type="spellStart"/>
       <w:r>
         <w:rPr>
           <w:b/>
@@ -507,7 +459,6 @@
         </w:rPr>
         <w:t>ChromaDB</w:t>
       </w:r>
-      <w:proofErr w:type="spellEnd"/>
       <w:r>
         <w:t xml:space="preserve"> serves as the vector database responsible for storing document embeddings and performing semantic similarity searches.</w:t>
       </w:r>
@@ -515,7 +466,7 @@
     <w:p>
       <w:r>
         <w:pict w14:anchorId="0F920008">
-          <v:rect id="_x0000_i1029" style="width:0;height:1.5pt" o:hralign="center" o:hrstd="t" o:hr="t"/>
+          <v:rect id="_x0000_i1030" style="width:0;height:1.5pt" o:hralign="center" o:hrstd="t" o:hr="t"/>
         </w:pict>
       </w:r>
     </w:p>
@@ -544,26 +495,25 @@
       </w:pPr>
       <w:bookmarkStart w:id="11" w:name="document-ingestion"/>
       <w:r>
+        <w:t>Document Ingestion</w:t>
+      </w:r>
+    </w:p>
+    <w:p>
+      <w:pPr>
+        <w:pStyle w:val="FirstParagraph"/>
+      </w:pPr>
+      <w:r>
+        <w:t>When a user uploads a PDF document, the system first validates the file and performs duplicate detection using a SHA-256 content hash. This prevents identical documents from being indexed multiple times.</w:t>
+      </w:r>
+    </w:p>
+    <w:p>
+      <w:pPr>
+        <w:pStyle w:val="BodyText"/>
+      </w:pPr>
+      <w:r>
         <w:lastRenderedPageBreak/>
-        <w:t>Document Ingestion</w:t>
-      </w:r>
-    </w:p>
-    <w:p>
-      <w:pPr>
-        <w:pStyle w:val="FirstParagraph"/>
-      </w:pPr>
-      <w:r>
-        <w:t>When a user uploads a PDF document, the system first validates the file and performs duplicate detection using a SHA-256 content hash. This prevents identical documents from being indexed multiple times.</w:t>
-      </w:r>
-    </w:p>
-    <w:p>
-      <w:pPr>
-        <w:pStyle w:val="BodyText"/>
-      </w:pPr>
-      <w:r>
         <w:t xml:space="preserve">Text is then extracted from the document using the </w:t>
       </w:r>
-      <w:proofErr w:type="spellStart"/>
       <w:r>
         <w:rPr>
           <w:b/>
@@ -571,7 +521,6 @@
         </w:rPr>
         <w:t>pypdf</w:t>
       </w:r>
-      <w:proofErr w:type="spellEnd"/>
       <w:r>
         <w:t xml:space="preserve"> library. The extracted content is divided into hierarchical chunks consisting of larger parent chunks and smaller child chunks.</w:t>
       </w:r>
@@ -596,33 +545,8 @@
           <w:b/>
           <w:bCs/>
         </w:rPr>
-        <w:t>BAAI/</w:t>
-      </w:r>
-      <w:proofErr w:type="spellStart"/>
-      <w:r>
-        <w:rPr>
-          <w:b/>
-          <w:bCs/>
-        </w:rPr>
-        <w:t>bge</w:t>
-      </w:r>
-      <w:proofErr w:type="spellEnd"/>
-      <w:r>
-        <w:rPr>
-          <w:b/>
-          <w:bCs/>
-        </w:rPr>
-        <w:t>-small-</w:t>
-      </w:r>
-      <w:proofErr w:type="spellStart"/>
-      <w:r>
-        <w:rPr>
-          <w:b/>
-          <w:bCs/>
-        </w:rPr>
-        <w:t>en</w:t>
-      </w:r>
-      <w:proofErr w:type="spellEnd"/>
+        <w:t>BAAI/bge-small-en</w:t>
+      </w:r>
       <w:r>
         <w:t xml:space="preserve"> embedding model running locally through </w:t>
       </w:r>
@@ -634,15 +558,7 @@
         <w:t>ONNX Runtime</w:t>
       </w:r>
       <w:r>
-        <w:t xml:space="preserve">. The generated embeddings are stored in </w:t>
-      </w:r>
-      <w:proofErr w:type="spellStart"/>
-      <w:r>
-        <w:t>ChromaDB</w:t>
-      </w:r>
-      <w:proofErr w:type="spellEnd"/>
-      <w:r>
-        <w:t xml:space="preserve"> together with metadata linking them to their original document sources.</w:t>
+        <w:t>. The generated embeddings are stored in ChromaDB together with metadata linking them to their original document sources.</w:t>
       </w:r>
     </w:p>
     <w:p>
@@ -684,15 +600,7 @@
         <w:pStyle w:val="BodyText"/>
       </w:pPr>
       <w:r>
-        <w:t xml:space="preserve">Each query variation is converted into an embedding and searched against </w:t>
-      </w:r>
-      <w:proofErr w:type="spellStart"/>
-      <w:r>
-        <w:t>ChromaDB</w:t>
-      </w:r>
-      <w:proofErr w:type="spellEnd"/>
-      <w:r>
-        <w:t>. Retrieved results are merged, filtered, and ranked according to relevance.</w:t>
+        <w:t>Each query variation is converted into an embedding and searched against ChromaDB. Retrieved results are merged, filtered, and ranked according to relevance.</w:t>
       </w:r>
     </w:p>
     <w:p>
@@ -706,7 +614,7 @@
     <w:p>
       <w:r>
         <w:pict w14:anchorId="6F17EAA6">
-          <v:rect id="_x0000_i1030" style="width:0;height:1.5pt" o:hralign="center" o:hrstd="t" o:hr="t"/>
+          <v:rect id="_x0000_i1031" style="width:0;height:1.5pt" o:hralign="center" o:hrstd="t" o:hr="t"/>
         </w:pict>
       </w:r>
     </w:p>
@@ -750,7 +658,6 @@
         </w:numPr>
       </w:pPr>
       <w:r>
-        <w:lastRenderedPageBreak/>
         <w:t>Conversational question answering</w:t>
       </w:r>
     </w:p>
@@ -811,6 +718,7 @@
         </w:numPr>
       </w:pPr>
       <w:r>
+        <w:lastRenderedPageBreak/>
         <w:t>Persistent document storage</w:t>
       </w:r>
     </w:p>
@@ -849,7 +757,7 @@
     <w:p>
       <w:r>
         <w:pict w14:anchorId="0391E7E8">
-          <v:rect id="_x0000_i1031" style="width:0;height:1.5pt" o:hralign="center" o:hrstd="t" o:hr="t"/>
+          <v:rect id="_x0000_i1032" style="width:0;height:1.5pt" o:hralign="center" o:hrstd="t" o:hr="t"/>
         </w:pict>
       </w:r>
     </w:p>
@@ -899,13 +807,8 @@
           <w:numId w:val="5"/>
         </w:numPr>
       </w:pPr>
-      <w:proofErr w:type="spellStart"/>
-      <w:r>
-        <w:t>Groq</w:t>
-      </w:r>
-      <w:proofErr w:type="spellEnd"/>
-      <w:r>
-        <w:t xml:space="preserve"> (Llama 3.3 70B)</w:t>
+      <w:r>
+        <w:t>Groq (Llama 3.3 70B)</w:t>
       </w:r>
     </w:p>
     <w:p>
@@ -916,11 +819,9 @@
           <w:numId w:val="5"/>
         </w:numPr>
       </w:pPr>
-      <w:proofErr w:type="spellStart"/>
       <w:r>
         <w:t>OpenRouter</w:t>
       </w:r>
-      <w:proofErr w:type="spellEnd"/>
     </w:p>
     <w:p>
       <w:pPr>
@@ -941,7 +842,7 @@
     <w:p>
       <w:r>
         <w:pict w14:anchorId="0F7A5DAA">
-          <v:rect id="_x0000_i1032" style="width:0;height:1.5pt" o:hralign="center" o:hrstd="t" o:hr="t"/>
+          <v:rect id="_x0000_i1033" style="width:0;height:1.5pt" o:hralign="center" o:hrstd="t" o:hr="t"/>
         </w:pict>
       </w:r>
     </w:p>
@@ -960,17 +861,8 @@
         <w:pStyle w:val="FirstParagraph"/>
       </w:pPr>
       <w:r>
-        <w:t xml:space="preserve">The </w:t>
-      </w:r>
-      <w:proofErr w:type="gramStart"/>
-      <w:r>
-        <w:t>frontend</w:t>
-      </w:r>
-      <w:proofErr w:type="gramEnd"/>
-      <w:r>
-        <w:t xml:space="preserve"> is deployed on </w:t>
-      </w:r>
-      <w:proofErr w:type="spellStart"/>
+        <w:t xml:space="preserve">The frontend is deployed on </w:t>
+      </w:r>
       <w:r>
         <w:rPr>
           <w:b/>
@@ -978,7 +870,6 @@
         </w:rPr>
         <w:t>Vercel</w:t>
       </w:r>
-      <w:proofErr w:type="spellEnd"/>
       <w:r>
         <w:t xml:space="preserve">, while the backend is deployed on </w:t>
       </w:r>
@@ -997,23 +888,8 @@
       <w:pPr>
         <w:pStyle w:val="BodyText"/>
       </w:pPr>
-      <w:proofErr w:type="spellStart"/>
-      <w:r>
-        <w:t>Vercel</w:t>
-      </w:r>
-      <w:proofErr w:type="spellEnd"/>
-      <w:r>
-        <w:t xml:space="preserve"> provides automatic deployments, HTTPS support, and global content delivery for the frontend </w:t>
-      </w:r>
-      <w:proofErr w:type="spellStart"/>
-      <w:proofErr w:type="gramStart"/>
-      <w:r>
-        <w:t>application.Railway</w:t>
-      </w:r>
-      <w:proofErr w:type="spellEnd"/>
-      <w:proofErr w:type="gramEnd"/>
-      <w:r>
-        <w:t xml:space="preserve"> provides container-based deployment, environment variable management, and persistent storage support for the backend services.</w:t>
+      <w:r>
+        <w:t>Vercel provides automatic deployments, HTTPS support, and global content delivery for the frontend application.Railway provides container-based deployment, environment variable management, and persistent storage support for the backend services.</w:t>
       </w:r>
     </w:p>
     <w:p>
@@ -1027,7 +903,7 @@
     <w:p>
       <w:r>
         <w:pict w14:anchorId="646806F1">
-          <v:rect id="_x0000_i1056" style="width:0;height:1.5pt" o:hralign="center" o:bullet="t" o:hrstd="t" o:hr="t"/>
+          <v:rect id="_x0000_i1034" style="width:0;height:1.5pt" o:hralign="center" o:bullet="t" o:hrstd="t" o:hr="t"/>
         </w:pict>
       </w:r>
     </w:p>
@@ -1037,10 +913,7 @@
       </w:pPr>
       <w:r>
         <w:lastRenderedPageBreak/>
-        <w:t xml:space="preserve">10. </w:t>
-      </w:r>
-      <w:r>
-        <w:t>DFD diagram</w:t>
+        <w:t>10. DFD diagram</w:t>
       </w:r>
     </w:p>
     <w:p>
@@ -1142,12 +1015,44 @@
       <w:bookmarkStart w:id="16" w:name="challenges-and-solutions"/>
       <w:bookmarkEnd w:id="15"/>
     </w:p>
+    <w:p/>
+    <w:p>
+      <w:r>
+        <w:lastRenderedPageBreak/>
+        <w:t>The Context Diagram</w:t>
+      </w:r>
+      <w:r>
+        <w:t xml:space="preserve"> (Level 0)</w:t>
+      </w:r>
+      <w:r>
+        <w:t xml:space="preserve"> provides a high-level view of the Study Buddy system and its interaction with external entities. The user uploads PDF documents and submits questions to the system, which returns document upload status and answers. To generate responses, the system sends the retrieved document context as a prompt to the LLM provider and receives the generated answer.</w:t>
+      </w:r>
+    </w:p>
     <w:p>
       <w:pPr>
         <w:pStyle w:val="Heading1"/>
-      </w:pPr>
-      <w:r>
-        <w:lastRenderedPageBreak/>
+        <w:rPr>
+          <w:rFonts w:asciiTheme="minorHAnsi" w:eastAsiaTheme="minorHAnsi" w:hAnsiTheme="minorHAnsi" w:cstheme="minorBidi"/>
+          <w:color w:val="auto"/>
+          <w:sz w:val="24"/>
+          <w:szCs w:val="24"/>
+        </w:rPr>
+      </w:pPr>
+      <w:r>
+        <w:rPr>
+          <w:rFonts w:asciiTheme="minorHAnsi" w:eastAsiaTheme="minorHAnsi" w:hAnsiTheme="minorHAnsi" w:cstheme="minorBidi"/>
+          <w:color w:val="auto"/>
+          <w:sz w:val="24"/>
+          <w:szCs w:val="24"/>
+        </w:rPr>
+        <w:t>The Level 1 Data Flow Diagram shows the internal working of the Study Buddy system by dividing it into three main processes: Manage Documents, Process Documents, and Answer Questions. Uploaded PDFs are stored in the PDF repository, processed into embeddings stored in ChromaDB, while metadata and chat history are maintained in the SQLite database. During question answering, relevant document chunks and conversation history are retrieved, the prompt is sent to the LLM provider, and the generated response is returned to the user.</w:t>
+      </w:r>
+    </w:p>
+    <w:p>
+      <w:pPr>
+        <w:pStyle w:val="Heading1"/>
+      </w:pPr>
+      <w:r>
         <w:t>1</w:t>
       </w:r>
       <w:r>
@@ -1170,15 +1075,7 @@
         <w:pStyle w:val="BodyText"/>
       </w:pPr>
       <w:r>
-        <w:t xml:space="preserve">Maintaining retrieval accuracy </w:t>
-      </w:r>
-      <w:proofErr w:type="gramStart"/>
-      <w:r>
-        <w:t>required</w:t>
-      </w:r>
-      <w:proofErr w:type="gramEnd"/>
-      <w:r>
-        <w:t xml:space="preserve"> balancing retrieval precision and contextual completeness. This challenge was addressed through the implementation of hierarchical parent-child chunking.</w:t>
+        <w:t>Maintaining retrieval accuracy required balancing retrieval precision and contextual completeness. This challenge was addressed through the implementation of hierarchical parent-child chunking.</w:t>
       </w:r>
     </w:p>
     <w:p>
@@ -1186,15 +1083,7 @@
         <w:pStyle w:val="BodyText"/>
       </w:pPr>
       <w:r>
-        <w:t xml:space="preserve">Handling conversational follow-up questions </w:t>
-      </w:r>
-      <w:proofErr w:type="gramStart"/>
-      <w:r>
-        <w:t>required</w:t>
-      </w:r>
-      <w:proofErr w:type="gramEnd"/>
-      <w:r>
-        <w:t xml:space="preserve"> preserving user context. This was solved through conversation memory and history-aware query rewriting.</w:t>
+        <w:t>Handling conversational follow-up questions required preserving user context. This was solved through conversation memory and history-aware query rewriting.</w:t>
       </w:r>
     </w:p>
     <w:p>
@@ -1210,21 +1099,13 @@
         <w:pStyle w:val="BodyText"/>
       </w:pPr>
       <w:r>
-        <w:t xml:space="preserve">Finally, maintaining persistent vector data across deployments </w:t>
-      </w:r>
-      <w:proofErr w:type="gramStart"/>
-      <w:r>
-        <w:t>required</w:t>
-      </w:r>
-      <w:proofErr w:type="gramEnd"/>
-      <w:r>
-        <w:t xml:space="preserve"> integrating Railway persistent volumes to prevent data loss.</w:t>
+        <w:t>Finally, maintaining persistent vector data across deployments required integrating Railway persistent volumes to prevent data loss.</w:t>
       </w:r>
     </w:p>
     <w:p>
       <w:r>
         <w:pict w14:anchorId="05DF30A2">
-          <v:rect id="_x0000_i1054" style="width:0;height:1.5pt" o:hralign="center" o:hrstd="t" o:hr="t"/>
+          <v:rect id="_x0000_i1035" style="width:0;height:1.5pt" o:hralign="center" o:hrstd="t" o:hr="t"/>
         </w:pict>
       </w:r>
     </w:p>
@@ -1326,8 +1207,9 @@
     </w:p>
     <w:p>
       <w:r>
+        <w:lastRenderedPageBreak/>
         <w:pict w14:anchorId="5E596B99">
-          <v:rect id="_x0000_i1055" style="width:0;height:1.5pt" o:hralign="center" o:hrstd="t" o:hr="t"/>
+          <v:rect id="_x0000_i1036" style="width:0;height:1.5pt" o:hralign="center" o:hrstd="t" o:hr="t"/>
         </w:pict>
       </w:r>
     </w:p>
@@ -1352,23 +1234,7 @@
         <w:pStyle w:val="FirstParagraph"/>
       </w:pPr>
       <w:r>
-        <w:t xml:space="preserve">Study Buddy demonstrates the successful implementation of a Retrieval-Augmented Generation system for document-based learning. By combining React, </w:t>
-      </w:r>
-      <w:proofErr w:type="spellStart"/>
-      <w:r>
-        <w:t>FastAPI</w:t>
-      </w:r>
-      <w:proofErr w:type="spellEnd"/>
-      <w:r>
-        <w:t xml:space="preserve">, SQLite, </w:t>
-      </w:r>
-      <w:proofErr w:type="spellStart"/>
-      <w:r>
-        <w:t>ChromaDB</w:t>
-      </w:r>
-      <w:proofErr w:type="spellEnd"/>
-      <w:r>
-        <w:t>, ONNX-based embeddings, and modern language models, the system transforms static PDF documents into an interactive question-answering platform.</w:t>
+        <w:t>Study Buddy demonstrates the successful implementation of a Retrieval-Augmented Generation system for document-based learning. By combining React, FastAPI, SQLite, ChromaDB, ONNX-based embeddings, and modern language models, the system transforms static PDF documents into an interactive question-answering platform.</w:t>
       </w:r>
     </w:p>
     <w:p>

</xml_diff>